<commit_message>
study aws section02 (11/10)
</commit_message>
<xml_diff>
--- a/비전공자도_이해할_수_있는_AWS_입문_실전/section02.docx
+++ b/비전공자도_이해할_수_있는_AWS_입문_실전/section02.docx
@@ -213,15 +213,7 @@
         <w:t>하지만</w:t>
       </w:r>
       <w:r>
-        <w:t xml:space="preserve"> IP 주소는 많은 숫자들로 이루어져 있어서 일일이 외우기가 너무 불편했다. 이 때문에 사람들이 기억하기 쉬운 문자로 컴퓨터의 주소를 나타낼 수는 </w:t>
-      </w:r>
-      <w:proofErr w:type="spellStart"/>
-      <w:r>
-        <w:t>없을까에</w:t>
-      </w:r>
-      <w:proofErr w:type="spellEnd"/>
-      <w:r>
-        <w:t xml:space="preserve"> 대해 고민하게 됐다. 숫자로 이루어져 있는 IP 주소를 문자로 구성하기에는 한계가 있었다. 왜냐하면 컴퓨터가 처리하기 쉬운 값의 형태는 문자가 아니라 숫자이기 때문이다.</w:t>
+        <w:t xml:space="preserve"> IP 주소는 많은 숫자들로 이루어져 있어서 일일이 외우기가 너무 불편했다. 이 때문에 사람들이 기억하기 쉬운 문자로 컴퓨터의 주소를 나타낼 수는 없을까에 대해 고민하게 됐다. 숫자로 이루어져 있는 IP 주소를 문자로 구성하기에는 한계가 있었다. 왜냐하면 컴퓨터가 처리하기 쉬운 값의 형태는 문자가 아니라 숫자이기 때문이다.</w:t>
       </w:r>
     </w:p>
     <w:p/>
@@ -336,143 +328,1180 @@
         <w:t>프론트</w:t>
       </w:r>
       <w:r>
-        <w:t xml:space="preserve"> 웹 </w:t>
-      </w:r>
-      <w:proofErr w:type="spellStart"/>
-      <w:r>
-        <w:t>페이지든</w:t>
-      </w:r>
-      <w:proofErr w:type="spellEnd"/>
-      <w:r>
+        <w:t xml:space="preserve"> 웹 페이지든 백엔드 서버든 일반적으로 IP를 기반으로 통신하지 않고 도메인을 기반으로 통신한다. 이유는 여러가지지만 그 이유 중 하나는 HTTPS 적용 때문이다. IP 주소에는 HTTPS 적용을 할 수가 없다. 도메인 주소가 있어야만 HTTPS 적용을 할 수 있다. 이 때문에 특정 서비스를 운영할 때 도메인은 필수적으로 사용하게</w:t>
+      </w:r>
+      <w:r>
+        <w:rPr>
+          <w:rFonts w:hint="eastAsia"/>
+        </w:rPr>
         <w:t xml:space="preserve"> </w:t>
       </w:r>
-      <w:proofErr w:type="spellStart"/>
-      <w:r>
-        <w:t>백엔드</w:t>
-      </w:r>
-      <w:proofErr w:type="spellEnd"/>
+      <w:r>
+        <w:t xml:space="preserve">된다. </w:t>
+      </w:r>
+    </w:p>
+    <w:p/>
+    <w:p>
+      <w:r>
+        <w:rPr>
+          <w:rFonts w:hint="eastAsia"/>
+        </w:rPr>
+        <w:t>하지만</w:t>
+      </w:r>
+      <w:r>
+        <w:t xml:space="preserve"> DNS의 역할을 하는 서비스는 AWS Route 53 뿐만 아니라 다양하게 존재한다. 가비아(gabia), 후이즈(whois) 등에서도 도메인을 구매하고 관리할 수 있다. 즉, DNS의 역할을 서비스를 하고 있다는 뜻이다. </w:t>
+      </w:r>
+    </w:p>
+    <w:p/>
+    <w:p>
+      <w:r>
+        <w:rPr>
+          <w:rFonts w:hint="eastAsia"/>
+        </w:rPr>
+        <w:t>현업에서는</w:t>
+      </w:r>
+      <w:r>
+        <w:t xml:space="preserve"> 무조건적으로 AWS Route 53을 고집하진 않는다. 왜냐면 각 서비스마다 구매할 수 있는 도메인의 종류가 다르기 때문이다. 쉽게 예를 들어, 가비아(gabia)에는 내가 원하는 형태의 도메인이 있는데 AWS Route 53에는 없을 수도 있다. 따라서 내가 원하는 도메인이 존재하는 곳의 DNS 서비스를 활용하자.</w:t>
+      </w:r>
+    </w:p>
+    <w:p/>
+    <w:p>
+      <w:pPr>
+        <w:pStyle w:val="1"/>
+      </w:pPr>
+      <w:r>
+        <w:rPr>
+          <w:rFonts w:hint="eastAsia"/>
+        </w:rPr>
+        <w:t>[실습]</w:t>
+      </w:r>
       <w:r>
         <w:t xml:space="preserve"> </w:t>
       </w:r>
-      <w:proofErr w:type="spellStart"/>
-      <w:r>
-        <w:t>서버든</w:t>
-      </w:r>
-      <w:proofErr w:type="spellEnd"/>
-      <w:r>
-        <w:t xml:space="preserve"> 일반적으로 IP를 기반으로 통신하지 않고 도메인을 기반으로 통신한다. 이유는 </w:t>
-      </w:r>
-      <w:proofErr w:type="spellStart"/>
-      <w:r>
-        <w:t>여러가지지만</w:t>
-      </w:r>
-      <w:proofErr w:type="spellEnd"/>
-      <w:r>
-        <w:t xml:space="preserve"> 그 이유 중 하나는 HTTPS 적용 때문이다. IP 주소에는 HTTPS 적용을 할 수가 없다. 도메인 주소가 있어야만 HTTPS 적용을 할 수 있다. 이 때문에 특정 서비스를 운영할 때 도메인은 필수적으로 사용하게</w:t>
-      </w:r>
-      <w:r>
-        <w:rPr>
-          <w:rFonts w:hint="eastAsia"/>
-        </w:rPr>
+      <w:r>
+        <w:rPr>
+          <w:rFonts w:hint="eastAsia"/>
+          <w:kern w:val="0"/>
+        </w:rPr>
+        <w:t>1. Route53에서 도메인 구매</w:t>
+      </w:r>
+    </w:p>
+    <w:p>
+      <w:pPr>
+        <w:pStyle w:val="2"/>
+      </w:pPr>
+      <w:r>
+        <w:rPr>
+          <w:rFonts w:hint="eastAsia"/>
+        </w:rPr>
+        <w:t>R</w:t>
+      </w:r>
+      <w:r>
+        <w:t>oute53</w:t>
+      </w:r>
+      <w:r>
+        <w:rPr>
+          <w:rFonts w:hint="eastAsia"/>
+        </w:rPr>
+        <w:t>에서 도메인 구매</w:t>
+      </w:r>
+    </w:p>
+    <w:p>
+      <w:pPr>
+        <w:rPr>
+          <w:rFonts w:hint="eastAsia"/>
+        </w:rPr>
+      </w:pPr>
+      <w:r>
+        <w:rPr>
+          <w:rFonts w:hint="eastAsia"/>
+        </w:rPr>
+        <w:t>도메인 등록을 선택한 후 시작하기를 누른다.</w:t>
+      </w:r>
+    </w:p>
+    <w:p>
+      <w:r>
+        <w:drawing>
+          <wp:inline distT="0" distB="0" distL="0" distR="0" wp14:anchorId="21037768" wp14:editId="5BCA83E5">
+            <wp:extent cx="5731510" cy="2201545"/>
+            <wp:effectExtent l="0" t="0" r="2540" b="8255"/>
+            <wp:docPr id="959674845" name="그림 1"/>
+            <wp:cNvGraphicFramePr>
+              <a:graphicFrameLocks xmlns:a="http://schemas.openxmlformats.org/drawingml/2006/main" noChangeAspect="1"/>
+            </wp:cNvGraphicFramePr>
+            <a:graphic xmlns:a="http://schemas.openxmlformats.org/drawingml/2006/main">
+              <a:graphicData uri="http://schemas.openxmlformats.org/drawingml/2006/picture">
+                <pic:pic xmlns:pic="http://schemas.openxmlformats.org/drawingml/2006/picture">
+                  <pic:nvPicPr>
+                    <pic:cNvPr id="959674845" name=""/>
+                    <pic:cNvPicPr/>
+                  </pic:nvPicPr>
+                  <pic:blipFill>
+                    <a:blip r:embed="rId9"/>
+                    <a:stretch>
+                      <a:fillRect/>
+                    </a:stretch>
+                  </pic:blipFill>
+                  <pic:spPr>
+                    <a:xfrm>
+                      <a:off x="0" y="0"/>
+                      <a:ext cx="5731510" cy="2201545"/>
+                    </a:xfrm>
+                    <a:prstGeom prst="rect">
+                      <a:avLst/>
+                    </a:prstGeom>
+                  </pic:spPr>
+                </pic:pic>
+              </a:graphicData>
+            </a:graphic>
+          </wp:inline>
+        </w:drawing>
+      </w:r>
+    </w:p>
+    <w:p>
+      <w:pPr>
+        <w:rPr>
+          <w:rFonts w:hint="eastAsia"/>
+        </w:rPr>
+      </w:pPr>
+      <w:r>
+        <w:rPr>
+          <w:rFonts w:hint="eastAsia"/>
+        </w:rPr>
+        <w:t>자신이 사용할 도메인을 검색한 후 원하는 도메인을 선택하고 결제를 진행한다.</w:t>
+      </w:r>
+    </w:p>
+    <w:p>
+      <w:r>
+        <w:lastRenderedPageBreak/>
+        <w:drawing>
+          <wp:inline distT="0" distB="0" distL="0" distR="0" wp14:anchorId="529C405F" wp14:editId="0F1354A3">
+            <wp:extent cx="5731510" cy="3073400"/>
+            <wp:effectExtent l="0" t="0" r="2540" b="0"/>
+            <wp:docPr id="61964123" name="그림 1"/>
+            <wp:cNvGraphicFramePr>
+              <a:graphicFrameLocks xmlns:a="http://schemas.openxmlformats.org/drawingml/2006/main" noChangeAspect="1"/>
+            </wp:cNvGraphicFramePr>
+            <a:graphic xmlns:a="http://schemas.openxmlformats.org/drawingml/2006/main">
+              <a:graphicData uri="http://schemas.openxmlformats.org/drawingml/2006/picture">
+                <pic:pic xmlns:pic="http://schemas.openxmlformats.org/drawingml/2006/picture">
+                  <pic:nvPicPr>
+                    <pic:cNvPr id="61964123" name=""/>
+                    <pic:cNvPicPr/>
+                  </pic:nvPicPr>
+                  <pic:blipFill>
+                    <a:blip r:embed="rId10"/>
+                    <a:stretch>
+                      <a:fillRect/>
+                    </a:stretch>
+                  </pic:blipFill>
+                  <pic:spPr>
+                    <a:xfrm>
+                      <a:off x="0" y="0"/>
+                      <a:ext cx="5731510" cy="3073400"/>
+                    </a:xfrm>
+                    <a:prstGeom prst="rect">
+                      <a:avLst/>
+                    </a:prstGeom>
+                  </pic:spPr>
+                </pic:pic>
+              </a:graphicData>
+            </a:graphic>
+          </wp:inline>
+        </w:drawing>
+      </w:r>
+    </w:p>
+    <w:p>
+      <w:pPr>
+        <w:rPr>
+          <w:rFonts w:hint="eastAsia"/>
+        </w:rPr>
+      </w:pPr>
+      <w:r>
+        <w:rPr>
+          <w:rFonts w:hint="eastAsia"/>
+        </w:rPr>
+        <w:t>기간과 기간이 끝나면 자동으로</w:t>
+      </w:r>
+      <w:r>
         <w:t xml:space="preserve"> </w:t>
       </w:r>
       <w:r>
-        <w:t xml:space="preserve">된다. </w:t>
+        <w:rPr>
+          <w:rFonts w:hint="eastAsia"/>
+        </w:rPr>
+        <w:t>갱신할 것인지를 선택한 후 다음을 누른다.</w:t>
+      </w:r>
+    </w:p>
+    <w:p>
+      <w:r>
+        <w:drawing>
+          <wp:inline distT="0" distB="0" distL="0" distR="0" wp14:anchorId="676AD188" wp14:editId="3CE06D7F">
+            <wp:extent cx="5731510" cy="1794510"/>
+            <wp:effectExtent l="0" t="0" r="2540" b="0"/>
+            <wp:docPr id="317387388" name="그림 1"/>
+            <wp:cNvGraphicFramePr>
+              <a:graphicFrameLocks xmlns:a="http://schemas.openxmlformats.org/drawingml/2006/main" noChangeAspect="1"/>
+            </wp:cNvGraphicFramePr>
+            <a:graphic xmlns:a="http://schemas.openxmlformats.org/drawingml/2006/main">
+              <a:graphicData uri="http://schemas.openxmlformats.org/drawingml/2006/picture">
+                <pic:pic xmlns:pic="http://schemas.openxmlformats.org/drawingml/2006/picture">
+                  <pic:nvPicPr>
+                    <pic:cNvPr id="317387388" name=""/>
+                    <pic:cNvPicPr/>
+                  </pic:nvPicPr>
+                  <pic:blipFill>
+                    <a:blip r:embed="rId11"/>
+                    <a:stretch>
+                      <a:fillRect/>
+                    </a:stretch>
+                  </pic:blipFill>
+                  <pic:spPr>
+                    <a:xfrm>
+                      <a:off x="0" y="0"/>
+                      <a:ext cx="5731510" cy="1794510"/>
+                    </a:xfrm>
+                    <a:prstGeom prst="rect">
+                      <a:avLst/>
+                    </a:prstGeom>
+                  </pic:spPr>
+                </pic:pic>
+              </a:graphicData>
+            </a:graphic>
+          </wp:inline>
+        </w:drawing>
+      </w:r>
+    </w:p>
+    <w:p>
+      <w:pPr>
+        <w:rPr>
+          <w:rFonts w:hint="eastAsia"/>
+        </w:rPr>
+      </w:pPr>
+      <w:r>
+        <w:rPr>
+          <w:rFonts w:hint="eastAsia"/>
+        </w:rPr>
+        <w:t>정보를 입력한다.</w:t>
+      </w:r>
+    </w:p>
+    <w:p>
+      <w:pPr>
+        <w:rPr>
+          <w:rFonts w:hint="eastAsia"/>
+        </w:rPr>
+      </w:pPr>
+      <w:r>
+        <w:drawing>
+          <wp:inline distT="0" distB="0" distL="0" distR="0" wp14:anchorId="7C67AC05" wp14:editId="65E84348">
+            <wp:extent cx="5731510" cy="2604135"/>
+            <wp:effectExtent l="0" t="0" r="2540" b="5715"/>
+            <wp:docPr id="175186115" name="그림 1"/>
+            <wp:cNvGraphicFramePr>
+              <a:graphicFrameLocks xmlns:a="http://schemas.openxmlformats.org/drawingml/2006/main" noChangeAspect="1"/>
+            </wp:cNvGraphicFramePr>
+            <a:graphic xmlns:a="http://schemas.openxmlformats.org/drawingml/2006/main">
+              <a:graphicData uri="http://schemas.openxmlformats.org/drawingml/2006/picture">
+                <pic:pic xmlns:pic="http://schemas.openxmlformats.org/drawingml/2006/picture">
+                  <pic:nvPicPr>
+                    <pic:cNvPr id="175186115" name=""/>
+                    <pic:cNvPicPr/>
+                  </pic:nvPicPr>
+                  <pic:blipFill>
+                    <a:blip r:embed="rId12"/>
+                    <a:stretch>
+                      <a:fillRect/>
+                    </a:stretch>
+                  </pic:blipFill>
+                  <pic:spPr>
+                    <a:xfrm>
+                      <a:off x="0" y="0"/>
+                      <a:ext cx="5731510" cy="2604135"/>
+                    </a:xfrm>
+                    <a:prstGeom prst="rect">
+                      <a:avLst/>
+                    </a:prstGeom>
+                  </pic:spPr>
+                </pic:pic>
+              </a:graphicData>
+            </a:graphic>
+          </wp:inline>
+        </w:drawing>
+      </w:r>
+    </w:p>
+    <w:p>
+      <w:pPr>
+        <w:rPr>
+          <w:rFonts w:hint="eastAsia"/>
+        </w:rPr>
+      </w:pPr>
+      <w:r>
+        <w:rPr>
+          <w:rFonts w:hint="eastAsia"/>
+        </w:rPr>
+        <w:lastRenderedPageBreak/>
+        <w:t>다른 건 몰라도 이메일은 정확하게 입력해야 한다.</w:t>
+      </w:r>
+      <w:r>
+        <w:t xml:space="preserve"> 10~20</w:t>
+      </w:r>
+      <w:r>
+        <w:rPr>
+          <w:rFonts w:hint="eastAsia"/>
+        </w:rPr>
+        <w:t>분 후에 등록한 이메일로 메일이 날라온다.</w:t>
+      </w:r>
+      <w:r>
+        <w:t xml:space="preserve"> </w:t>
+      </w:r>
+      <w:r>
+        <w:rPr>
+          <w:rFonts w:hint="eastAsia"/>
+        </w:rPr>
+        <w:t>이 메일을 확인해야만 정상적으로 도메인이 등록된다.</w:t>
+      </w:r>
+    </w:p>
+    <w:p>
+      <w:r>
+        <w:rPr>
+          <w:noProof/>
+        </w:rPr>
+        <w:drawing>
+          <wp:inline distT="0" distB="0" distL="0" distR="0" wp14:anchorId="2A700D32" wp14:editId="703BEFF4">
+            <wp:extent cx="5731510" cy="2176780"/>
+            <wp:effectExtent l="0" t="0" r="2540" b="0"/>
+            <wp:docPr id="1419201772" name="그림 1"/>
+            <wp:cNvGraphicFramePr>
+              <a:graphicFrameLocks xmlns:a="http://schemas.openxmlformats.org/drawingml/2006/main" noChangeAspect="1"/>
+            </wp:cNvGraphicFramePr>
+            <a:graphic xmlns:a="http://schemas.openxmlformats.org/drawingml/2006/main">
+              <a:graphicData uri="http://schemas.openxmlformats.org/drawingml/2006/picture">
+                <pic:pic xmlns:pic="http://schemas.openxmlformats.org/drawingml/2006/picture">
+                  <pic:nvPicPr>
+                    <pic:cNvPr id="0" name="Picture 1"/>
+                    <pic:cNvPicPr>
+                      <a:picLocks noChangeAspect="1" noChangeArrowheads="1"/>
+                    </pic:cNvPicPr>
+                  </pic:nvPicPr>
+                  <pic:blipFill>
+                    <a:blip r:embed="rId13" cstate="print">
+                      <a:extLst>
+                        <a:ext uri="{28A0092B-C50C-407E-A947-70E740481C1C}">
+                          <a14:useLocalDpi xmlns:a14="http://schemas.microsoft.com/office/drawing/2010/main" val="0"/>
+                        </a:ext>
+                      </a:extLst>
+                    </a:blip>
+                    <a:srcRect/>
+                    <a:stretch>
+                      <a:fillRect/>
+                    </a:stretch>
+                  </pic:blipFill>
+                  <pic:spPr bwMode="auto">
+                    <a:xfrm>
+                      <a:off x="0" y="0"/>
+                      <a:ext cx="5731510" cy="2176780"/>
+                    </a:xfrm>
+                    <a:prstGeom prst="rect">
+                      <a:avLst/>
+                    </a:prstGeom>
+                    <a:noFill/>
+                    <a:ln>
+                      <a:noFill/>
+                    </a:ln>
+                  </pic:spPr>
+                </pic:pic>
+              </a:graphicData>
+            </a:graphic>
+          </wp:inline>
+        </w:drawing>
+      </w:r>
+    </w:p>
+    <w:p>
+      <w:pPr>
+        <w:jc w:val="right"/>
+        <w:rPr>
+          <w:rFonts w:hint="eastAsia"/>
+        </w:rPr>
+      </w:pPr>
+      <w:r>
+        <w:rPr>
+          <w:rFonts w:hint="eastAsia"/>
+        </w:rPr>
+        <w:t>출처:</w:t>
+      </w:r>
+      <w:r>
+        <w:t xml:space="preserve"> </w:t>
+      </w:r>
+      <w:r>
+        <w:rPr>
+          <w:rFonts w:hint="eastAsia"/>
+        </w:rPr>
+        <w:t>강의</w:t>
+      </w:r>
+    </w:p>
+    <w:p>
+      <w:pPr>
+        <w:pStyle w:val="2"/>
+      </w:pPr>
+      <w:r>
+        <w:rPr>
+          <w:rFonts w:hint="eastAsia"/>
+        </w:rPr>
+        <w:t>도메인 구매 잘 됐는지 확인</w:t>
+      </w:r>
+    </w:p>
+    <w:p>
+      <w:r>
+        <w:rPr>
+          <w:rFonts w:hint="eastAsia"/>
+        </w:rPr>
+        <w:t>[호스팅 영역]</w:t>
+      </w:r>
+    </w:p>
+    <w:p>
+      <w:r>
+        <w:rPr>
+          <w:noProof/>
+        </w:rPr>
+        <w:drawing>
+          <wp:inline distT="0" distB="0" distL="0" distR="0" wp14:anchorId="7E1E3904" wp14:editId="774DACA3">
+            <wp:extent cx="5731510" cy="1534160"/>
+            <wp:effectExtent l="0" t="0" r="2540" b="8890"/>
+            <wp:docPr id="1966436525" name="그림 2"/>
+            <wp:cNvGraphicFramePr>
+              <a:graphicFrameLocks xmlns:a="http://schemas.openxmlformats.org/drawingml/2006/main" noChangeAspect="1"/>
+            </wp:cNvGraphicFramePr>
+            <a:graphic xmlns:a="http://schemas.openxmlformats.org/drawingml/2006/main">
+              <a:graphicData uri="http://schemas.openxmlformats.org/drawingml/2006/picture">
+                <pic:pic xmlns:pic="http://schemas.openxmlformats.org/drawingml/2006/picture">
+                  <pic:nvPicPr>
+                    <pic:cNvPr id="0" name="Picture 3"/>
+                    <pic:cNvPicPr>
+                      <a:picLocks noChangeAspect="1" noChangeArrowheads="1"/>
+                    </pic:cNvPicPr>
+                  </pic:nvPicPr>
+                  <pic:blipFill>
+                    <a:blip r:embed="rId14" cstate="print">
+                      <a:extLst>
+                        <a:ext uri="{28A0092B-C50C-407E-A947-70E740481C1C}">
+                          <a14:useLocalDpi xmlns:a14="http://schemas.microsoft.com/office/drawing/2010/main" val="0"/>
+                        </a:ext>
+                      </a:extLst>
+                    </a:blip>
+                    <a:srcRect/>
+                    <a:stretch>
+                      <a:fillRect/>
+                    </a:stretch>
+                  </pic:blipFill>
+                  <pic:spPr bwMode="auto">
+                    <a:xfrm>
+                      <a:off x="0" y="0"/>
+                      <a:ext cx="5731510" cy="1534160"/>
+                    </a:xfrm>
+                    <a:prstGeom prst="rect">
+                      <a:avLst/>
+                    </a:prstGeom>
+                    <a:noFill/>
+                    <a:ln>
+                      <a:noFill/>
+                    </a:ln>
+                  </pic:spPr>
+                </pic:pic>
+              </a:graphicData>
+            </a:graphic>
+          </wp:inline>
+        </w:drawing>
+      </w:r>
+    </w:p>
+    <w:p>
+      <w:pPr>
+        <w:jc w:val="right"/>
+      </w:pPr>
+      <w:r>
+        <w:rPr>
+          <w:rFonts w:hint="eastAsia"/>
+        </w:rPr>
+        <w:t>출처:</w:t>
+      </w:r>
+      <w:r>
+        <w:t xml:space="preserve"> </w:t>
+      </w:r>
+      <w:r>
+        <w:rPr>
+          <w:rFonts w:hint="eastAsia"/>
+        </w:rPr>
+        <w:t>강의</w:t>
+      </w:r>
+    </w:p>
+    <w:p>
+      <w:r>
+        <w:rPr>
+          <w:rFonts w:hint="eastAsia"/>
+        </w:rPr>
+        <w:t>[등록된 도메인]</w:t>
+      </w:r>
+    </w:p>
+    <w:p>
+      <w:pPr>
+        <w:rPr>
+          <w:rFonts w:hint="eastAsia"/>
+        </w:rPr>
+      </w:pPr>
+      <w:r>
+        <w:rPr>
+          <w:noProof/>
+        </w:rPr>
+        <w:drawing>
+          <wp:inline distT="0" distB="0" distL="0" distR="0" wp14:anchorId="7A181917" wp14:editId="31F82014">
+            <wp:extent cx="5731510" cy="1921510"/>
+            <wp:effectExtent l="0" t="0" r="2540" b="2540"/>
+            <wp:docPr id="2009674138" name="그림 3"/>
+            <wp:cNvGraphicFramePr>
+              <a:graphicFrameLocks xmlns:a="http://schemas.openxmlformats.org/drawingml/2006/main" noChangeAspect="1"/>
+            </wp:cNvGraphicFramePr>
+            <a:graphic xmlns:a="http://schemas.openxmlformats.org/drawingml/2006/main">
+              <a:graphicData uri="http://schemas.openxmlformats.org/drawingml/2006/picture">
+                <pic:pic xmlns:pic="http://schemas.openxmlformats.org/drawingml/2006/picture">
+                  <pic:nvPicPr>
+                    <pic:cNvPr id="0" name="Picture 5"/>
+                    <pic:cNvPicPr>
+                      <a:picLocks noChangeAspect="1" noChangeArrowheads="1"/>
+                    </pic:cNvPicPr>
+                  </pic:nvPicPr>
+                  <pic:blipFill>
+                    <a:blip r:embed="rId15" cstate="print">
+                      <a:extLst>
+                        <a:ext uri="{28A0092B-C50C-407E-A947-70E740481C1C}">
+                          <a14:useLocalDpi xmlns:a14="http://schemas.microsoft.com/office/drawing/2010/main" val="0"/>
+                        </a:ext>
+                      </a:extLst>
+                    </a:blip>
+                    <a:srcRect/>
+                    <a:stretch>
+                      <a:fillRect/>
+                    </a:stretch>
+                  </pic:blipFill>
+                  <pic:spPr bwMode="auto">
+                    <a:xfrm>
+                      <a:off x="0" y="0"/>
+                      <a:ext cx="5731510" cy="1921510"/>
+                    </a:xfrm>
+                    <a:prstGeom prst="rect">
+                      <a:avLst/>
+                    </a:prstGeom>
+                    <a:noFill/>
+                    <a:ln>
+                      <a:noFill/>
+                    </a:ln>
+                  </pic:spPr>
+                </pic:pic>
+              </a:graphicData>
+            </a:graphic>
+          </wp:inline>
+        </w:drawing>
+      </w:r>
+    </w:p>
+    <w:p>
+      <w:pPr>
+        <w:jc w:val="right"/>
+      </w:pPr>
+      <w:r>
+        <w:rPr>
+          <w:rFonts w:hint="eastAsia"/>
+        </w:rPr>
+        <w:t>출처:</w:t>
+      </w:r>
+      <w:r>
+        <w:t xml:space="preserve"> </w:t>
+      </w:r>
+      <w:r>
+        <w:rPr>
+          <w:rFonts w:hint="eastAsia"/>
+        </w:rPr>
+        <w:t>강의</w:t>
+      </w:r>
+    </w:p>
+    <w:p>
+      <w:pPr>
+        <w:rPr>
+          <w:rFonts w:hint="eastAsia"/>
+        </w:rPr>
+      </w:pPr>
+    </w:p>
+    <w:p>
+      <w:pPr>
+        <w:pStyle w:val="1"/>
+      </w:pPr>
+      <w:r>
+        <w:rPr>
+          <w:rFonts w:hint="eastAsia"/>
+        </w:rPr>
+        <w:t>[실습]</w:t>
+      </w:r>
+      <w:r>
+        <w:t xml:space="preserve"> </w:t>
+      </w:r>
+      <w:r>
+        <w:rPr>
+          <w:rFonts w:hint="eastAsia"/>
+          <w:kern w:val="0"/>
+        </w:rPr>
+        <w:t>2. Route53의 도메인을 EC2에 연결하기</w:t>
+      </w:r>
+    </w:p>
+    <w:p>
+      <w:pPr>
+        <w:pStyle w:val="1"/>
+      </w:pPr>
+      <w:r>
+        <w:rPr>
+          <w:rFonts w:hint="eastAsia"/>
+        </w:rPr>
+        <w:t>R</w:t>
+      </w:r>
+      <w:r>
+        <w:t>oute53</w:t>
+      </w:r>
+      <w:r>
+        <w:rPr>
+          <w:rFonts w:hint="eastAsia"/>
+        </w:rPr>
+        <w:t xml:space="preserve">의 도메인을 </w:t>
+      </w:r>
+      <w:r>
+        <w:t>EC2</w:t>
+      </w:r>
+      <w:r>
+        <w:rPr>
+          <w:rFonts w:hint="eastAsia"/>
+        </w:rPr>
+        <w:t>에 연결하기</w:t>
+      </w:r>
+    </w:p>
+    <w:p>
+      <w:pPr>
+        <w:pStyle w:val="a3"/>
+        <w:numPr>
+          <w:ilvl w:val="0"/>
+          <w:numId w:val="7"/>
+        </w:numPr>
+        <w:ind w:leftChars="0"/>
+      </w:pPr>
+      <w:r>
+        <w:rPr>
+          <w:rFonts w:hint="eastAsia"/>
+        </w:rPr>
+        <w:t>R</w:t>
+      </w:r>
+      <w:r>
+        <w:t>oute53</w:t>
+      </w:r>
+      <w:r>
+        <w:rPr>
+          <w:rFonts w:hint="eastAsia"/>
+        </w:rPr>
+        <w:t>의 호스팅 영역 메뉴에 들어가서 레코드 생성 버튼 누르기</w:t>
+      </w:r>
+    </w:p>
+    <w:p>
+      <w:r>
+        <w:rPr>
+          <w:noProof/>
+        </w:rPr>
+        <w:drawing>
+          <wp:inline distT="0" distB="0" distL="0" distR="0" wp14:anchorId="6EC0C659" wp14:editId="4A85E6BA">
+            <wp:extent cx="5731510" cy="2620010"/>
+            <wp:effectExtent l="0" t="0" r="2540" b="8890"/>
+            <wp:docPr id="172461076" name="그림 4"/>
+            <wp:cNvGraphicFramePr>
+              <a:graphicFrameLocks xmlns:a="http://schemas.openxmlformats.org/drawingml/2006/main" noChangeAspect="1"/>
+            </wp:cNvGraphicFramePr>
+            <a:graphic xmlns:a="http://schemas.openxmlformats.org/drawingml/2006/main">
+              <a:graphicData uri="http://schemas.openxmlformats.org/drawingml/2006/picture">
+                <pic:pic xmlns:pic="http://schemas.openxmlformats.org/drawingml/2006/picture">
+                  <pic:nvPicPr>
+                    <pic:cNvPr id="0" name="Picture 7"/>
+                    <pic:cNvPicPr>
+                      <a:picLocks noChangeAspect="1" noChangeArrowheads="1"/>
+                    </pic:cNvPicPr>
+                  </pic:nvPicPr>
+                  <pic:blipFill>
+                    <a:blip r:embed="rId16" cstate="print">
+                      <a:extLst>
+                        <a:ext uri="{28A0092B-C50C-407E-A947-70E740481C1C}">
+                          <a14:useLocalDpi xmlns:a14="http://schemas.microsoft.com/office/drawing/2010/main" val="0"/>
+                        </a:ext>
+                      </a:extLst>
+                    </a:blip>
+                    <a:srcRect/>
+                    <a:stretch>
+                      <a:fillRect/>
+                    </a:stretch>
+                  </pic:blipFill>
+                  <pic:spPr bwMode="auto">
+                    <a:xfrm>
+                      <a:off x="0" y="0"/>
+                      <a:ext cx="5731510" cy="2620010"/>
+                    </a:xfrm>
+                    <a:prstGeom prst="rect">
+                      <a:avLst/>
+                    </a:prstGeom>
+                    <a:noFill/>
+                    <a:ln>
+                      <a:noFill/>
+                    </a:ln>
+                  </pic:spPr>
+                </pic:pic>
+              </a:graphicData>
+            </a:graphic>
+          </wp:inline>
+        </w:drawing>
+      </w:r>
+    </w:p>
+    <w:p>
+      <w:r>
+        <w:rPr>
+          <w:noProof/>
+        </w:rPr>
+        <w:drawing>
+          <wp:inline distT="0" distB="0" distL="0" distR="0" wp14:anchorId="618EBE43" wp14:editId="7F19C7B1">
+            <wp:extent cx="5731510" cy="2514600"/>
+            <wp:effectExtent l="0" t="0" r="2540" b="0"/>
+            <wp:docPr id="957345611" name="그림 5"/>
+            <wp:cNvGraphicFramePr>
+              <a:graphicFrameLocks xmlns:a="http://schemas.openxmlformats.org/drawingml/2006/main" noChangeAspect="1"/>
+            </wp:cNvGraphicFramePr>
+            <a:graphic xmlns:a="http://schemas.openxmlformats.org/drawingml/2006/main">
+              <a:graphicData uri="http://schemas.openxmlformats.org/drawingml/2006/picture">
+                <pic:pic xmlns:pic="http://schemas.openxmlformats.org/drawingml/2006/picture">
+                  <pic:nvPicPr>
+                    <pic:cNvPr id="0" name="Picture 9"/>
+                    <pic:cNvPicPr>
+                      <a:picLocks noChangeAspect="1" noChangeArrowheads="1"/>
+                    </pic:cNvPicPr>
+                  </pic:nvPicPr>
+                  <pic:blipFill>
+                    <a:blip r:embed="rId17" cstate="print">
+                      <a:extLst>
+                        <a:ext uri="{28A0092B-C50C-407E-A947-70E740481C1C}">
+                          <a14:useLocalDpi xmlns:a14="http://schemas.microsoft.com/office/drawing/2010/main" val="0"/>
+                        </a:ext>
+                      </a:extLst>
+                    </a:blip>
+                    <a:srcRect/>
+                    <a:stretch>
+                      <a:fillRect/>
+                    </a:stretch>
+                  </pic:blipFill>
+                  <pic:spPr bwMode="auto">
+                    <a:xfrm>
+                      <a:off x="0" y="0"/>
+                      <a:ext cx="5731510" cy="2514600"/>
+                    </a:xfrm>
+                    <a:prstGeom prst="rect">
+                      <a:avLst/>
+                    </a:prstGeom>
+                    <a:noFill/>
+                    <a:ln>
+                      <a:noFill/>
+                    </a:ln>
+                  </pic:spPr>
+                </pic:pic>
+              </a:graphicData>
+            </a:graphic>
+          </wp:inline>
+        </w:drawing>
+      </w:r>
+    </w:p>
+    <w:p>
+      <w:pPr>
+        <w:rPr>
+          <w:rFonts w:hint="eastAsia"/>
+        </w:rPr>
+      </w:pPr>
+    </w:p>
+    <w:p>
+      <w:pPr>
+        <w:pStyle w:val="a3"/>
+        <w:numPr>
+          <w:ilvl w:val="0"/>
+          <w:numId w:val="7"/>
+        </w:numPr>
+        <w:ind w:leftChars="0"/>
+      </w:pPr>
+      <w:r>
+        <w:rPr>
+          <w:rFonts w:hint="eastAsia"/>
+        </w:rPr>
+        <w:t>레코드 생성하기</w:t>
+      </w:r>
+    </w:p>
+    <w:p>
+      <w:r>
+        <w:rPr>
+          <w:noProof/>
+        </w:rPr>
+        <w:lastRenderedPageBreak/>
+        <w:drawing>
+          <wp:inline distT="0" distB="0" distL="0" distR="0" wp14:anchorId="0C0CCF1F" wp14:editId="4A49502D">
+            <wp:extent cx="5731510" cy="3388995"/>
+            <wp:effectExtent l="0" t="0" r="2540" b="1905"/>
+            <wp:docPr id="345077214" name="그림 6"/>
+            <wp:cNvGraphicFramePr>
+              <a:graphicFrameLocks xmlns:a="http://schemas.openxmlformats.org/drawingml/2006/main" noChangeAspect="1"/>
+            </wp:cNvGraphicFramePr>
+            <a:graphic xmlns:a="http://schemas.openxmlformats.org/drawingml/2006/main">
+              <a:graphicData uri="http://schemas.openxmlformats.org/drawingml/2006/picture">
+                <pic:pic xmlns:pic="http://schemas.openxmlformats.org/drawingml/2006/picture">
+                  <pic:nvPicPr>
+                    <pic:cNvPr id="0" name="Picture 11"/>
+                    <pic:cNvPicPr>
+                      <a:picLocks noChangeAspect="1" noChangeArrowheads="1"/>
+                    </pic:cNvPicPr>
+                  </pic:nvPicPr>
+                  <pic:blipFill>
+                    <a:blip r:embed="rId18" cstate="print">
+                      <a:extLst>
+                        <a:ext uri="{28A0092B-C50C-407E-A947-70E740481C1C}">
+                          <a14:useLocalDpi xmlns:a14="http://schemas.microsoft.com/office/drawing/2010/main" val="0"/>
+                        </a:ext>
+                      </a:extLst>
+                    </a:blip>
+                    <a:srcRect/>
+                    <a:stretch>
+                      <a:fillRect/>
+                    </a:stretch>
+                  </pic:blipFill>
+                  <pic:spPr bwMode="auto">
+                    <a:xfrm>
+                      <a:off x="0" y="0"/>
+                      <a:ext cx="5731510" cy="3388995"/>
+                    </a:xfrm>
+                    <a:prstGeom prst="rect">
+                      <a:avLst/>
+                    </a:prstGeom>
+                    <a:noFill/>
+                    <a:ln>
+                      <a:noFill/>
+                    </a:ln>
+                  </pic:spPr>
+                </pic:pic>
+              </a:graphicData>
+            </a:graphic>
+          </wp:inline>
+        </w:drawing>
+      </w:r>
+    </w:p>
+    <w:p>
+      <w:r>
+        <w:rPr>
+          <w:noProof/>
+        </w:rPr>
+        <w:drawing>
+          <wp:inline distT="0" distB="0" distL="0" distR="0" wp14:anchorId="0D7DD39B" wp14:editId="10A8E6A8">
+            <wp:extent cx="5731510" cy="2392045"/>
+            <wp:effectExtent l="0" t="0" r="2540" b="8255"/>
+            <wp:docPr id="2141166630" name="그림 7"/>
+            <wp:cNvGraphicFramePr>
+              <a:graphicFrameLocks xmlns:a="http://schemas.openxmlformats.org/drawingml/2006/main" noChangeAspect="1"/>
+            </wp:cNvGraphicFramePr>
+            <a:graphic xmlns:a="http://schemas.openxmlformats.org/drawingml/2006/main">
+              <a:graphicData uri="http://schemas.openxmlformats.org/drawingml/2006/picture">
+                <pic:pic xmlns:pic="http://schemas.openxmlformats.org/drawingml/2006/picture">
+                  <pic:nvPicPr>
+                    <pic:cNvPr id="0" name="Picture 13"/>
+                    <pic:cNvPicPr>
+                      <a:picLocks noChangeAspect="1" noChangeArrowheads="1"/>
+                    </pic:cNvPicPr>
+                  </pic:nvPicPr>
+                  <pic:blipFill>
+                    <a:blip r:embed="rId19" cstate="print">
+                      <a:extLst>
+                        <a:ext uri="{28A0092B-C50C-407E-A947-70E740481C1C}">
+                          <a14:useLocalDpi xmlns:a14="http://schemas.microsoft.com/office/drawing/2010/main" val="0"/>
+                        </a:ext>
+                      </a:extLst>
+                    </a:blip>
+                    <a:srcRect/>
+                    <a:stretch>
+                      <a:fillRect/>
+                    </a:stretch>
+                  </pic:blipFill>
+                  <pic:spPr bwMode="auto">
+                    <a:xfrm>
+                      <a:off x="0" y="0"/>
+                      <a:ext cx="5731510" cy="2392045"/>
+                    </a:xfrm>
+                    <a:prstGeom prst="rect">
+                      <a:avLst/>
+                    </a:prstGeom>
+                    <a:noFill/>
+                    <a:ln>
+                      <a:noFill/>
+                    </a:ln>
+                  </pic:spPr>
+                </pic:pic>
+              </a:graphicData>
+            </a:graphic>
+          </wp:inline>
+        </w:drawing>
+      </w:r>
+    </w:p>
+    <w:p>
+      <w:r>
+        <w:rPr>
+          <w:rFonts w:hint="eastAsia"/>
+        </w:rPr>
+        <w:t>위와</w:t>
+      </w:r>
+      <w:r>
+        <w:t xml:space="preserve"> 같이 설정할 경우 `jscode-edu.link`의 도메인으로 접속했을 때 `52.79.34.240`의 IP 주소로 연결시켜준다는 뜻이다.</w:t>
+      </w:r>
+    </w:p>
+    <w:p>
+      <w:r>
+        <w:rPr>
+          <w:rFonts w:hint="eastAsia"/>
+        </w:rPr>
+        <w:t>만약</w:t>
+      </w:r>
+      <w:r>
+        <w:t xml:space="preserve"> `api.jscode-edu.link`의 도메인으로 접속했을 때 `52.79.34.240`의 IP 주소로 연결시켜주고 싶다면 레코드 이름의 빈칸에 `api`를 적으면 된다. 이와 같이 하나의 도메인만 구매하더라도 여러 개의 서브 도메인을 사용할 수 있다. (`jscode-edu.link`가 주 도메인이고, `___.jscode-edu.link` 형태의 도메인이 서브 도메인이다.)</w:t>
       </w:r>
     </w:p>
     <w:p/>
     <w:p>
-      <w:r>
-        <w:rPr>
-          <w:rFonts w:hint="eastAsia"/>
-        </w:rPr>
-        <w:t>하지만</w:t>
-      </w:r>
-      <w:r>
-        <w:t xml:space="preserve"> DNS의 역할을 하는 서비스는 AWS Route 53 뿐만 아니라 다양하게 존재한다. </w:t>
-      </w:r>
-      <w:proofErr w:type="spellStart"/>
-      <w:r>
-        <w:t>가비아</w:t>
-      </w:r>
-      <w:proofErr w:type="spellEnd"/>
-      <w:r>
-        <w:t>(</w:t>
-      </w:r>
-      <w:proofErr w:type="spellStart"/>
-      <w:r>
-        <w:t>gabia</w:t>
-      </w:r>
-      <w:proofErr w:type="spellEnd"/>
-      <w:r>
-        <w:t xml:space="preserve">), </w:t>
-      </w:r>
-      <w:proofErr w:type="spellStart"/>
-      <w:r>
-        <w:t>후이즈</w:t>
-      </w:r>
-      <w:proofErr w:type="spellEnd"/>
-      <w:r>
-        <w:t>(</w:t>
-      </w:r>
-      <w:proofErr w:type="spellStart"/>
-      <w:r>
-        <w:t>whois</w:t>
-      </w:r>
-      <w:proofErr w:type="spellEnd"/>
-      <w:r>
-        <w:t xml:space="preserve">) 등에서도 도메인을 구매하고 관리할 수 있다. 즉, DNS의 역할을 서비스를 하고 있다는 뜻이다. </w:t>
+      <w:pPr>
+        <w:pStyle w:val="a3"/>
+        <w:numPr>
+          <w:ilvl w:val="0"/>
+          <w:numId w:val="7"/>
+        </w:numPr>
+        <w:ind w:leftChars="0"/>
+      </w:pPr>
+      <w:r>
+        <w:rPr>
+          <w:rFonts w:hint="eastAsia"/>
+        </w:rPr>
+        <w:t>접속되는 지 확인하기</w:t>
+      </w:r>
+    </w:p>
+    <w:p>
+      <w:pPr>
+        <w:rPr>
+          <w:rFonts w:hint="eastAsia"/>
+        </w:rPr>
+      </w:pPr>
+      <w:r>
+        <w:rPr>
+          <w:rFonts w:hint="eastAsia"/>
+        </w:rPr>
+        <w:t>A</w:t>
+      </w:r>
+      <w:r>
+        <w:t xml:space="preserve"> </w:t>
+      </w:r>
+      <w:r>
+        <w:rPr>
+          <w:rFonts w:hint="eastAsia"/>
+        </w:rPr>
+        <w:t xml:space="preserve">레코드로 추가하고나서 도메인이 적용되는데 </w:t>
+      </w:r>
+      <w:r>
+        <w:t>5~10</w:t>
+      </w:r>
+      <w:r>
+        <w:rPr>
+          <w:rFonts w:hint="eastAsia"/>
+        </w:rPr>
+        <w:t>분 정도 걸린다.</w:t>
+      </w:r>
+      <w:r>
+        <w:t xml:space="preserve"> </w:t>
+      </w:r>
+      <w:r>
+        <w:rPr>
+          <w:rFonts w:hint="eastAsia"/>
+        </w:rPr>
+        <w:t>시간이 잠시 지난 후 도메</w:t>
+      </w:r>
+      <w:r>
+        <w:rPr>
+          <w:rFonts w:hint="eastAsia"/>
+        </w:rPr>
+        <w:lastRenderedPageBreak/>
+        <w:t>인에 접속하여 테스트하자.</w:t>
+      </w:r>
+    </w:p>
+    <w:p>
+      <w:r>
+        <w:rPr>
+          <w:noProof/>
+        </w:rPr>
+        <w:drawing>
+          <wp:inline distT="0" distB="0" distL="0" distR="0" wp14:anchorId="3E195DB6" wp14:editId="2B111BC2">
+            <wp:extent cx="5731510" cy="1583690"/>
+            <wp:effectExtent l="0" t="0" r="2540" b="0"/>
+            <wp:docPr id="1295594624" name="그림 8"/>
+            <wp:cNvGraphicFramePr>
+              <a:graphicFrameLocks xmlns:a="http://schemas.openxmlformats.org/drawingml/2006/main" noChangeAspect="1"/>
+            </wp:cNvGraphicFramePr>
+            <a:graphic xmlns:a="http://schemas.openxmlformats.org/drawingml/2006/main">
+              <a:graphicData uri="http://schemas.openxmlformats.org/drawingml/2006/picture">
+                <pic:pic xmlns:pic="http://schemas.openxmlformats.org/drawingml/2006/picture">
+                  <pic:nvPicPr>
+                    <pic:cNvPr id="0" name="Picture 15"/>
+                    <pic:cNvPicPr>
+                      <a:picLocks noChangeAspect="1" noChangeArrowheads="1"/>
+                    </pic:cNvPicPr>
+                  </pic:nvPicPr>
+                  <pic:blipFill>
+                    <a:blip r:embed="rId20">
+                      <a:extLst>
+                        <a:ext uri="{28A0092B-C50C-407E-A947-70E740481C1C}">
+                          <a14:useLocalDpi xmlns:a14="http://schemas.microsoft.com/office/drawing/2010/main" val="0"/>
+                        </a:ext>
+                      </a:extLst>
+                    </a:blip>
+                    <a:srcRect/>
+                    <a:stretch>
+                      <a:fillRect/>
+                    </a:stretch>
+                  </pic:blipFill>
+                  <pic:spPr bwMode="auto">
+                    <a:xfrm>
+                      <a:off x="0" y="0"/>
+                      <a:ext cx="5731510" cy="1583690"/>
+                    </a:xfrm>
+                    <a:prstGeom prst="rect">
+                      <a:avLst/>
+                    </a:prstGeom>
+                    <a:noFill/>
+                    <a:ln>
+                      <a:noFill/>
+                    </a:ln>
+                  </pic:spPr>
+                </pic:pic>
+              </a:graphicData>
+            </a:graphic>
+          </wp:inline>
+        </w:drawing>
+      </w:r>
+    </w:p>
+    <w:p>
+      <w:pPr>
+        <w:pStyle w:val="2"/>
+      </w:pPr>
+      <w:r>
+        <w:rPr>
+          <w:rFonts w:hint="eastAsia"/>
+        </w:rPr>
+        <w:t>레코드 유형</w:t>
+      </w:r>
+    </w:p>
+    <w:p>
+      <w:r>
+        <w:t>DNS에 공통적으로 있는 설정 중 하나가 레코드 유형이다. 많은 레코드 유형이 있지만 2가지(A 레코드, CNAME 레코드)만 확실히 알고 있으면 충분하다.</w:t>
+      </w:r>
+    </w:p>
+    <w:p>
+      <w:r>
+        <w:rPr>
+          <w:noProof/>
+        </w:rPr>
+        <w:drawing>
+          <wp:inline distT="0" distB="0" distL="0" distR="0" wp14:anchorId="2935D709" wp14:editId="035ED865">
+            <wp:extent cx="5731510" cy="3601720"/>
+            <wp:effectExtent l="0" t="0" r="2540" b="0"/>
+            <wp:docPr id="1687455789" name="그림 9"/>
+            <wp:cNvGraphicFramePr>
+              <a:graphicFrameLocks xmlns:a="http://schemas.openxmlformats.org/drawingml/2006/main" noChangeAspect="1"/>
+            </wp:cNvGraphicFramePr>
+            <a:graphic xmlns:a="http://schemas.openxmlformats.org/drawingml/2006/main">
+              <a:graphicData uri="http://schemas.openxmlformats.org/drawingml/2006/picture">
+                <pic:pic xmlns:pic="http://schemas.openxmlformats.org/drawingml/2006/picture">
+                  <pic:nvPicPr>
+                    <pic:cNvPr id="0" name="Picture 17"/>
+                    <pic:cNvPicPr>
+                      <a:picLocks noChangeAspect="1" noChangeArrowheads="1"/>
+                    </pic:cNvPicPr>
+                  </pic:nvPicPr>
+                  <pic:blipFill>
+                    <a:blip r:embed="rId21" cstate="print">
+                      <a:extLst>
+                        <a:ext uri="{28A0092B-C50C-407E-A947-70E740481C1C}">
+                          <a14:useLocalDpi xmlns:a14="http://schemas.microsoft.com/office/drawing/2010/main" val="0"/>
+                        </a:ext>
+                      </a:extLst>
+                    </a:blip>
+                    <a:srcRect/>
+                    <a:stretch>
+                      <a:fillRect/>
+                    </a:stretch>
+                  </pic:blipFill>
+                  <pic:spPr bwMode="auto">
+                    <a:xfrm>
+                      <a:off x="0" y="0"/>
+                      <a:ext cx="5731510" cy="3601720"/>
+                    </a:xfrm>
+                    <a:prstGeom prst="rect">
+                      <a:avLst/>
+                    </a:prstGeom>
+                    <a:noFill/>
+                    <a:ln>
+                      <a:noFill/>
+                    </a:ln>
+                  </pic:spPr>
+                </pic:pic>
+              </a:graphicData>
+            </a:graphic>
+          </wp:inline>
+        </w:drawing>
+      </w:r>
+    </w:p>
+    <w:p>
+      <w:r>
+        <w:t>1. A 레코드</w:t>
+      </w:r>
+    </w:p>
+    <w:p>
+      <w:r>
+        <w:t xml:space="preserve">도메인을 특정 IPv4 주소에 연결시키고 싶을 때 사용하는 레코드 유형이다. </w:t>
+      </w:r>
+    </w:p>
+    <w:p>
+      <w:r>
+        <w:t>2</w:t>
+      </w:r>
+      <w:r>
+        <w:t>. CNAME 레코드</w:t>
+      </w:r>
+    </w:p>
+    <w:p>
+      <w:r>
+        <w:t xml:space="preserve">도메인을 특정 도메인 주소에 연결시키고 싶을 때 사용하는 레코드 유형이다. </w:t>
+      </w:r>
+    </w:p>
+    <w:p>
+      <w:pPr>
+        <w:rPr>
+          <w:rFonts w:hint="eastAsia"/>
+        </w:rPr>
+      </w:pPr>
+      <w:r>
+        <w:t>만약 CNAME 레코드의 값으로 `www.naver.com`을 적었다고 가정하자. 그러면 해당 도메인으로 접속했을 때, `www.naver.com`으로 연결되어 이동한다.</w:t>
       </w:r>
     </w:p>
     <w:p/>
     <w:p>
       <w:pPr>
-        <w:rPr>
-          <w:rFonts w:hint="eastAsia"/>
-        </w:rPr>
-      </w:pPr>
-      <w:r>
-        <w:rPr>
-          <w:rFonts w:hint="eastAsia"/>
-        </w:rPr>
-        <w:t>현업에서는</w:t>
-      </w:r>
-      <w:r>
-        <w:t xml:space="preserve"> 무조건적으로 AWS Route 53을 고집하진 않는다. 왜냐면 각 서비스마다 구매할 수 있는 도메인의 종류가 다르기 때문이다. 쉽게 예를 들어, </w:t>
-      </w:r>
-      <w:proofErr w:type="spellStart"/>
-      <w:r>
-        <w:t>가비아</w:t>
-      </w:r>
-      <w:proofErr w:type="spellEnd"/>
-      <w:r>
-        <w:t>(</w:t>
-      </w:r>
-      <w:proofErr w:type="spellStart"/>
-      <w:r>
-        <w:t>gabia</w:t>
-      </w:r>
-      <w:proofErr w:type="spellEnd"/>
-      <w:r>
-        <w:t>)에는 내가 원하는 형태의 도메인이 있는데 AWS Route 53에는 없을 수도 있다. 따라서 내가 원하는 도메인이 존재하는 곳의 DNS 서비스를 활용하자.</w:t>
-      </w:r>
-    </w:p>
-    <w:p>
-      <w:pPr>
-        <w:rPr>
-          <w:rFonts w:hint="eastAsia"/>
-        </w:rPr>
-      </w:pPr>
-    </w:p>
-    <w:p>
-      <w:pPr>
         <w:pStyle w:val="1"/>
       </w:pPr>
       <w:r>
         <w:rPr>
           <w:rFonts w:hint="eastAsia"/>
         </w:rPr>
-        <w:t>[실습]</w:t>
+        <w:t>[보충 강의]</w:t>
       </w:r>
       <w:r>
         <w:t xml:space="preserve"> </w:t>
@@ -480,142 +1509,190 @@
       <w:r>
         <w:rPr>
           <w:rFonts w:hint="eastAsia"/>
-          <w:kern w:val="0"/>
-        </w:rPr>
-        <w:t>1. Route53에서 도메인 구매</w:t>
+        </w:rPr>
+        <w:t>무료로 도메인 구매하는 방법</w:t>
       </w:r>
     </w:p>
     <w:p>
       <w:pPr>
         <w:pStyle w:val="2"/>
-      </w:pPr>
-      <w:r>
-        <w:rPr>
-          <w:rFonts w:hint="eastAsia"/>
-        </w:rPr>
-        <w:t>R</w:t>
-      </w:r>
-      <w:r>
-        <w:t>oute53</w:t>
-      </w:r>
-      <w:r>
-        <w:rPr>
-          <w:rFonts w:hint="eastAsia"/>
-        </w:rPr>
-        <w:t>에서 도메인 구매</w:t>
+        <w:rPr>
+          <w:rFonts w:hint="eastAsia"/>
+        </w:rPr>
+      </w:pPr>
+      <w:r>
+        <w:rPr>
+          <w:rFonts w:hint="eastAsia"/>
+        </w:rPr>
+        <w:t>참고 사이트</w:t>
+      </w:r>
+    </w:p>
+    <w:p>
+      <w:hyperlink r:id="rId22" w:history="1">
+        <w:r>
+          <w:rPr>
+            <w:rStyle w:val="a4"/>
+          </w:rPr>
+          <w:t>https://cloud-information.tistory.com/11</w:t>
+        </w:r>
+      </w:hyperlink>
+    </w:p>
+    <w:p>
+      <w:hyperlink r:id="rId23" w:history="1">
+        <w:r>
+          <w:rPr>
+            <w:rStyle w:val="a4"/>
+          </w:rPr>
+          <w:t>https://xn--220b31d95hq8o.xn--3e0b707e/</w:t>
+        </w:r>
+      </w:hyperlink>
+    </w:p>
+    <w:p>
+      <w:pPr>
+        <w:pStyle w:val="2"/>
+      </w:pPr>
+      <w:r>
+        <w:rPr>
+          <w:rFonts w:hint="eastAsia"/>
+        </w:rPr>
+        <w:t>주의할 점</w:t>
+      </w:r>
+    </w:p>
+    <w:p>
+      <w:pPr>
+        <w:rPr>
+          <w:rFonts w:hint="eastAsia"/>
+        </w:rPr>
+      </w:pPr>
+      <w:r>
+        <w:rPr>
+          <w:rFonts w:hint="eastAsia"/>
+        </w:rPr>
+        <w:t>실제</w:t>
+      </w:r>
+      <w:r>
+        <w:t xml:space="preserve"> 운영할 서버에는 무료 도메인을 사용하지 말자. 무료 도메인은 생각보다 불안정하다. 중간에 도메인을 통한 접속이 끊기기도 한다. 즉, 서비스가 중단되는 경우가 발생할 수 있다는 뜻이다.</w:t>
       </w:r>
     </w:p>
     <w:p/>
+    <w:p>
+      <w:pPr>
+        <w:pStyle w:val="1"/>
+      </w:pPr>
+      <w:r>
+        <w:rPr>
+          <w:rFonts w:hint="eastAsia"/>
+        </w:rPr>
+        <w:t>[보충 자료]</w:t>
+      </w:r>
+      <w:r>
+        <w:t xml:space="preserve"> </w:t>
+      </w:r>
+      <w:r>
+        <w:rPr>
+          <w:rFonts w:hint="eastAsia"/>
+        </w:rPr>
+        <w:t xml:space="preserve">비용 나가지 않게 </w:t>
+      </w:r>
+      <w:r>
+        <w:t xml:space="preserve">Routee53 </w:t>
+      </w:r>
+      <w:r>
+        <w:rPr>
+          <w:rFonts w:hint="eastAsia"/>
+        </w:rPr>
+        <w:t>깔끔하게 종료하기</w:t>
+      </w:r>
+    </w:p>
+    <w:p>
+      <w:r>
+        <w:t>Rotue53에서 도메인을 구매하게 되면</w:t>
+      </w:r>
+      <w:r>
+        <w:rPr>
+          <w:rFonts w:hint="eastAsia"/>
+        </w:rPr>
+        <w:t xml:space="preserve"> </w:t>
+      </w:r>
+      <w:r>
+        <w:rPr>
+          <w:rFonts w:hint="eastAsia"/>
+        </w:rPr>
+        <w:t>자동으로</w:t>
+      </w:r>
+      <w:r>
+        <w:t xml:space="preserve"> 구매한 도메인에 대한 호스팅 영역(Hosted Zone)이 생성되게 됩니다.</w:t>
+      </w:r>
+    </w:p>
+    <w:p>
+      <w:r>
+        <w:t>Route 53에서는 호스팅 영역(Hosted Zone)을 생성한 채로 두면</w:t>
+      </w:r>
+      <w:r>
+        <w:rPr>
+          <w:rFonts w:hint="eastAsia"/>
+        </w:rPr>
+        <w:t xml:space="preserve"> </w:t>
+      </w:r>
+      <w:r>
+        <w:rPr>
+          <w:rFonts w:hint="eastAsia"/>
+        </w:rPr>
+        <w:t>매달</w:t>
+      </w:r>
+      <w:r>
+        <w:t xml:space="preserve"> 소액(월 약 $0.50)의 비용이 지속적으로 발생합니다.</w:t>
+      </w:r>
+    </w:p>
+    <w:p>
+      <w:r>
+        <w:rPr>
+          <w:rFonts w:hint="eastAsia"/>
+        </w:rPr>
+        <w:t>따라서</w:t>
+      </w:r>
+      <w:r>
+        <w:t xml:space="preserve"> 이후에 더 이상 도메인을 사용할 일이 없다면</w:t>
+      </w:r>
+      <w:r>
+        <w:rPr>
+          <w:rFonts w:hint="eastAsia"/>
+        </w:rPr>
+        <w:t xml:space="preserve"> </w:t>
+      </w:r>
+      <w:r>
+        <w:rPr>
+          <w:rFonts w:hint="eastAsia"/>
+        </w:rPr>
+        <w:t>호스팅</w:t>
+      </w:r>
+      <w:r>
+        <w:t xml:space="preserve"> 영역(Hosted Zone) 내의 레코드 및 호스팅 영역을 삭제하시는 걸 권장드립니다!</w:t>
+      </w:r>
+    </w:p>
+    <w:p>
+      <w:r>
+        <w:rPr>
+          <w:rFonts w:hint="eastAsia"/>
+        </w:rPr>
+        <w:t>참고로</w:t>
+      </w:r>
+      <w:r>
+        <w:t xml:space="preserve"> 도메인은 처음 구매할 때만 1회성으로 비용이 나갑니다. (1년 이후에 갱신을 할 때만 추가 비용 발생)</w:t>
+      </w:r>
+    </w:p>
+    <w:p>
+      <w:r>
+        <w:rPr>
+          <w:rFonts w:hint="eastAsia"/>
+        </w:rPr>
+        <w:t>이미</w:t>
+      </w:r>
+      <w:r>
+        <w:t xml:space="preserve"> 구매한 도메인은 보유하고 있는 동안에 추가적인 비용이 나가지 않습니다.</w:t>
+      </w:r>
+    </w:p>
     <w:p/>
-    <w:p>
-      <w:pPr>
-        <w:pStyle w:val="2"/>
-      </w:pPr>
-      <w:r>
-        <w:rPr>
-          <w:rFonts w:hint="eastAsia"/>
-        </w:rPr>
-        <w:t>도메인 구매 잘 됐는지 확인</w:t>
-      </w:r>
-    </w:p>
-    <w:p>
-      <w:pPr>
-        <w:rPr>
-          <w:rFonts w:hint="eastAsia"/>
-        </w:rPr>
-      </w:pPr>
-    </w:p>
-    <w:p/>
-    <w:p>
-      <w:pPr>
-        <w:pStyle w:val="1"/>
-      </w:pPr>
-      <w:r>
-        <w:rPr>
-          <w:rFonts w:hint="eastAsia"/>
-        </w:rPr>
-        <w:t>[실습]</w:t>
-      </w:r>
-      <w:r>
-        <w:t xml:space="preserve"> </w:t>
-      </w:r>
-      <w:r>
-        <w:rPr>
-          <w:rFonts w:hint="eastAsia"/>
-          <w:kern w:val="0"/>
-        </w:rPr>
-        <w:t>2. Route53의 도메인을 EC2에 연결하기</w:t>
-      </w:r>
-    </w:p>
-    <w:p/>
-    <w:p>
-      <w:pPr>
-        <w:rPr>
-          <w:rFonts w:hint="eastAsia"/>
-        </w:rPr>
-      </w:pPr>
-    </w:p>
-    <w:p/>
-    <w:p>
-      <w:pPr>
-        <w:pStyle w:val="1"/>
-      </w:pPr>
-      <w:r>
-        <w:rPr>
-          <w:rFonts w:hint="eastAsia"/>
-        </w:rPr>
-        <w:lastRenderedPageBreak/>
-        <w:t>[보충 강의]</w:t>
-      </w:r>
-      <w:r>
-        <w:t xml:space="preserve"> </w:t>
-      </w:r>
-      <w:r>
-        <w:rPr>
-          <w:rFonts w:hint="eastAsia"/>
-        </w:rPr>
-        <w:t>무료로 도메인 구매하는 방법</w:t>
-      </w:r>
-    </w:p>
-    <w:p/>
-    <w:p/>
-    <w:p>
-      <w:pPr>
-        <w:pStyle w:val="1"/>
-      </w:pPr>
-      <w:r>
-        <w:rPr>
-          <w:rFonts w:hint="eastAsia"/>
-        </w:rPr>
-        <w:t>[보충 자료]</w:t>
-      </w:r>
-      <w:r>
-        <w:t xml:space="preserve"> </w:t>
-      </w:r>
-      <w:r>
-        <w:rPr>
-          <w:rFonts w:hint="eastAsia"/>
-        </w:rPr>
-        <w:t xml:space="preserve">비용 나가지 않게 </w:t>
-      </w:r>
-      <w:r>
-        <w:t xml:space="preserve">Routee53 </w:t>
-      </w:r>
-      <w:r>
-        <w:rPr>
-          <w:rFonts w:hint="eastAsia"/>
-        </w:rPr>
-        <w:t>깔끔하게 종료하기</w:t>
-      </w:r>
-    </w:p>
-    <w:p/>
-    <w:p>
-      <w:pPr>
-        <w:rPr>
-          <w:rFonts w:hint="eastAsia"/>
-        </w:rPr>
-      </w:pPr>
-    </w:p>
     <w:sectPr>
       <w:pgSz w:w="11906" w:h="16838"/>
       <w:pgMar w:top="1701" w:right="1440" w:bottom="1440" w:left="1440" w:header="851" w:footer="992" w:gutter="0"/>
@@ -1209,6 +2286,95 @@
       </w:pPr>
     </w:lvl>
   </w:abstractNum>
+  <w:abstractNum w:abstractNumId="6" w15:restartNumberingAfterBreak="0">
+    <w:nsid w:val="6F7E0D52"/>
+    <w:multiLevelType w:val="hybridMultilevel"/>
+    <w:tmpl w:val="CD54CBCC"/>
+    <w:lvl w:ilvl="0" w:tplc="25A699B8">
+      <w:start w:val="1"/>
+      <w:numFmt w:val="decimal"/>
+      <w:lvlText w:val="%1."/>
+      <w:lvlJc w:val="left"/>
+      <w:pPr>
+        <w:ind w:left="800" w:hanging="360"/>
+      </w:pPr>
+      <w:rPr>
+        <w:rFonts w:hint="default"/>
+      </w:rPr>
+    </w:lvl>
+    <w:lvl w:ilvl="1" w:tplc="04090019" w:tentative="1">
+      <w:start w:val="1"/>
+      <w:numFmt w:val="upperLetter"/>
+      <w:lvlText w:val="%2."/>
+      <w:lvlJc w:val="left"/>
+      <w:pPr>
+        <w:ind w:left="1320" w:hanging="440"/>
+      </w:pPr>
+    </w:lvl>
+    <w:lvl w:ilvl="2" w:tplc="0409001B" w:tentative="1">
+      <w:start w:val="1"/>
+      <w:numFmt w:val="lowerRoman"/>
+      <w:lvlText w:val="%3."/>
+      <w:lvlJc w:val="right"/>
+      <w:pPr>
+        <w:ind w:left="1760" w:hanging="440"/>
+      </w:pPr>
+    </w:lvl>
+    <w:lvl w:ilvl="3" w:tplc="0409000F" w:tentative="1">
+      <w:start w:val="1"/>
+      <w:numFmt w:val="decimal"/>
+      <w:lvlText w:val="%4."/>
+      <w:lvlJc w:val="left"/>
+      <w:pPr>
+        <w:ind w:left="2200" w:hanging="440"/>
+      </w:pPr>
+    </w:lvl>
+    <w:lvl w:ilvl="4" w:tplc="04090019" w:tentative="1">
+      <w:start w:val="1"/>
+      <w:numFmt w:val="upperLetter"/>
+      <w:lvlText w:val="%5."/>
+      <w:lvlJc w:val="left"/>
+      <w:pPr>
+        <w:ind w:left="2640" w:hanging="440"/>
+      </w:pPr>
+    </w:lvl>
+    <w:lvl w:ilvl="5" w:tplc="0409001B" w:tentative="1">
+      <w:start w:val="1"/>
+      <w:numFmt w:val="lowerRoman"/>
+      <w:lvlText w:val="%6."/>
+      <w:lvlJc w:val="right"/>
+      <w:pPr>
+        <w:ind w:left="3080" w:hanging="440"/>
+      </w:pPr>
+    </w:lvl>
+    <w:lvl w:ilvl="6" w:tplc="0409000F" w:tentative="1">
+      <w:start w:val="1"/>
+      <w:numFmt w:val="decimal"/>
+      <w:lvlText w:val="%7."/>
+      <w:lvlJc w:val="left"/>
+      <w:pPr>
+        <w:ind w:left="3520" w:hanging="440"/>
+      </w:pPr>
+    </w:lvl>
+    <w:lvl w:ilvl="7" w:tplc="04090019" w:tentative="1">
+      <w:start w:val="1"/>
+      <w:numFmt w:val="upperLetter"/>
+      <w:lvlText w:val="%8."/>
+      <w:lvlJc w:val="left"/>
+      <w:pPr>
+        <w:ind w:left="3960" w:hanging="440"/>
+      </w:pPr>
+    </w:lvl>
+    <w:lvl w:ilvl="8" w:tplc="0409001B" w:tentative="1">
+      <w:start w:val="1"/>
+      <w:numFmt w:val="lowerRoman"/>
+      <w:lvlText w:val="%9."/>
+      <w:lvlJc w:val="right"/>
+      <w:pPr>
+        <w:ind w:left="4400" w:hanging="440"/>
+      </w:pPr>
+    </w:lvl>
+  </w:abstractNum>
   <w:num w:numId="1" w16cid:durableId="1589344522">
     <w:abstractNumId w:val="0"/>
   </w:num>
@@ -1226,6 +2392,9 @@
   </w:num>
   <w:num w:numId="6" w16cid:durableId="319040084">
     <w:abstractNumId w:val="1"/>
+  </w:num>
+  <w:num w:numId="7" w16cid:durableId="454831063">
+    <w:abstractNumId w:val="6"/>
   </w:num>
 </w:numbering>
 </file>
@@ -1693,6 +2862,7 @@
   <w:style w:type="character" w:default="1" w:styleId="a0">
     <w:name w:val="Default Paragraph Font"/>
     <w:uiPriority w:val="1"/>
+    <w:semiHidden/>
     <w:unhideWhenUsed/>
   </w:style>
   <w:style w:type="table" w:default="1" w:styleId="a1">

</xml_diff>